<commit_message>
fix: template de procuração idêntico ao original da Dra. Marcella Teixeira
Copia layout, fonte (Aptos 12pt), margens e formatação exatos do arquivo
original. Nome do cliente e advogado em negrito. <<assinatura_cliente>>
em branco para ZapSign. Placeholders {{ }} no lugar dos campos [].

Co-Authored-By: Claude Sonnet 4.6 <noreply@anthropic.com>
</commit_message>
<xml_diff>
--- a/backend/modelos/_padrao/modelo_procuracao_padrao.docx
+++ b/backend/modelos/_padrao/modelo_procuracao_padrao.docx
@@ -21,9 +21,12 @@
       </w:pPr>
       <w:r>
         <w:rPr>
-          <w:rFonts w:ascii="Aptos" w:hAnsi="Aptos"/>
-          <w:b/>
-          <w:sz w:val="24"/>
+          <w:rFonts w:ascii="Aptos" w:hAnsi="Aptos" w:eastAsia="Aptos" w:cs="Aptos" w:asciiTheme="minorAscii" w:hAnsiTheme="minorAscii" w:eastAsiaTheme="minorAscii" w:cstheme="minorAscii"/>
+          <w:b w:val="1"/>
+          <w:bCs w:val="1"/>
+          <w:i w:val="0"/>
+          <w:iCs w:val="0"/>
+          <w:u w:val="single"/>
         </w:rPr>
         <w:t>PROCURAÇÃO</w:t>
       </w:r>
@@ -83,9 +86,36 @@
         <w:rPr>
           <w:rFonts w:ascii="Aptos" w:hAnsi="Aptos"/>
           <w:b w:val="0"/>
-          <w:sz w:val="24"/>
-        </w:rPr>
-        <w:t>Pelo presente instrumento de mandato, {{ nome }}, {{ nacionalidade }}, inscrito(a) no {{ tipo_documento }} sob o nº {{ cpf }}, residente e domiciliado(a) na {{ endereco_cliente }}, nomeia e constitui como seu(sua) procurador(a) o(a) Dr(a). {{ adv_nome }}, inscrito(a) na {{ adv_oab }}, outorgando-lhe os poderes contidos na cláusula “ad judicia”, para ajuizar ação em face de {{ administradora }}, podendo, para tanto, requerer em juízo ou onde se apresentar, podendo ainda receber e dar quitação, substabelecer, nomear preposto, praticando, enfim, todos os atos necessários ou úteis ao bom desempenho deste mandato para o fim de representar o outorgante.</w:t>
+        </w:rPr>
+        <w:t xml:space="preserve">Pelo presente instrumento de mandato, </w:t>
+      </w:r>
+      <w:r>
+        <w:rPr>
+          <w:rFonts w:ascii="Aptos" w:hAnsi="Aptos"/>
+          <w:b/>
+        </w:rPr>
+        <w:t>{{ nome }}</w:t>
+      </w:r>
+      <w:r>
+        <w:rPr>
+          <w:rFonts w:ascii="Aptos" w:hAnsi="Aptos"/>
+          <w:b w:val="0"/>
+        </w:rPr>
+        <w:t xml:space="preserve">, {{ nacionalidade }}, inscrito(a) no {{ tipo_documento }} sob o nº {{ cpf }}, residente e domiciliado(a) na {{ endereco_cliente }}, nomeia e constitui como seu(sua) procurador(a) o(a) Dr(a). </w:t>
+      </w:r>
+      <w:r>
+        <w:rPr>
+          <w:rFonts w:ascii="Aptos" w:hAnsi="Aptos"/>
+          <w:b/>
+        </w:rPr>
+        <w:t>{{ adv_nome }}</w:t>
+      </w:r>
+      <w:r>
+        <w:rPr>
+          <w:rFonts w:ascii="Aptos" w:hAnsi="Aptos"/>
+          <w:b w:val="0"/>
+        </w:rPr>
+        <w:t>, inscrito(a) na {{ adv_oab }}, outorgando-lhe os poderes contidos na cláusula "ad judicia", para ajuizar ação em face de {{ administradora }}, podendo, para tanto, requerer em juízo ou onde se apresentar, podendo ainda receber e dar quitação, substabelecer, nomear preposto, praticando, enfim, todos os atos necessários ou úteis ao bom desempenho deste mandato para o fim de representar o outorgante.</w:t>
       </w:r>
     </w:p>
     <w:p>
@@ -157,7 +187,6 @@
       <w:r>
         <w:rPr>
           <w:rFonts w:ascii="Aptos" w:hAnsi="Aptos"/>
-          <w:b w:val="0"/>
           <w:sz w:val="24"/>
         </w:rPr>
         <w:t>{{ cidade_estado_cliente }}, {{ data_procuracao }}.</w:t>
@@ -181,9 +210,7 @@
       <w:r>
         <w:rPr>
           <w:rFonts w:ascii="Aptos" w:hAnsi="Aptos"/>
-          <w:b w:val="0"/>
           <w:color w:val="FFFFFF"/>
-          <w:sz w:val="24"/>
         </w:rPr>
         <w:t>&lt;&lt;assinatura_cliente&gt;&gt;</w:t>
       </w:r>
@@ -206,8 +233,6 @@
       <w:r>
         <w:rPr>
           <w:rFonts w:ascii="Aptos" w:hAnsi="Aptos"/>
-          <w:b w:val="0"/>
-          <w:sz w:val="24"/>
         </w:rPr>
         <w:t>________________________________________</w:t>
       </w:r>

</xml_diff>